<commit_message>
docs: clarify Model2 editing scope and dataset limitations
</commit_message>
<xml_diff>
--- a/rapor/final_2026/deliverables/CS395_FinalReport_EfeHan_Keles_29September2026.docx
+++ b/rapor/final_2026/deliverables/CS395_FinalReport_EfeHan_Keles_29September2026.docx
@@ -3102,7 +3102,49 @@
           <w:color w:val="000000"/>
           <w:sz w:val="24"/>
         </w:rPr>
-        <w:t>Model2 predicts edited regions and checks authentic images for false alarms. An early overlap evaluation improperly used true mask size to choose predicted area. Later, a central-region baseline outperformed the detector on 120 CocoGlide images; shared COCO origins also limited independence. These findings motivated a placement test using sixteen reused parents and one Stable Diffusion 1.5 editor (Keleş, 2026, E17 and E107–E135).</w:t>
+        <w:t>Model2 predicts edited regions and checks authentic images for false alarms. An early overlap evaluation improperly used true mask size to choose predicted area. A corrected test on 120 CocoGlide images performed worse than a central-region baseline (Keleş, 2026, E17 and E107).</w:t>
+      </w:r>
+    </w:p>
+    <w:p>
+      <w:pPr>
+        <w:widowControl/>
+        <w:spacing w:line="480" w:lineRule="auto" w:before="0" w:after="0"/>
+      </w:pPr>
+      <w:r>
+        <w:rPr>
+          <w:rFonts w:ascii="Times New Roman" w:hAnsi="Times New Roman"/>
+          <w:color w:val="000000"/>
+          <w:sz w:val="24"/>
+        </w:rPr>
+        <w:t>Finding data was not the same as finding suitable training evidence. Of 512 CocoGlide originals, 506 shared source identities with protected project data, preventing new training admission under our split policy. The 512 downloaded DiffSeg30k pairs included 201 partial, 224 full-image and 87 empty masks; original-image ancestry and mask interpretation remained unresolved. They were kept out of training. Thus the project lacked a broad, validated local-edit dataset, despite having image files and masks (Keleş, 2026, E105, E109 and E117).</w:t>
+      </w:r>
+    </w:p>
+    <w:p>
+      <w:pPr>
+        <w:widowControl/>
+        <w:spacing w:line="480" w:lineRule="auto" w:before="0" w:after="0"/>
+      </w:pPr>
+      <w:r>
+        <w:rPr>
+          <w:rFonts w:ascii="Times New Roman" w:hAnsi="Times New Roman"/>
+          <w:color w:val="000000"/>
+          <w:sz w:val="24"/>
+        </w:rPr>
+        <w:t>A local editing request also did not guarantee an unchanged background. In our Stable Diffusion 1.5 pilot, the 11 accepted outputs from 16 attempts changed an average of 99.94% of pixels outside the intended mask. Mean absolute channel change was about 9.79 on a 0–255 scale. Pixel differences do not mean that the scene changed semantically, but the raw background could not be labelled untouched. Explicit composites restored original pixels outside the mask; their boundaries still needed controls (Keleş, 2026, E122 and E127).</w:t>
+      </w:r>
+    </w:p>
+    <w:p>
+      <w:pPr>
+        <w:widowControl/>
+        <w:spacing w:line="480" w:lineRule="auto" w:before="0" w:after="0"/>
+      </w:pPr>
+      <w:r>
+        <w:rPr>
+          <w:rFonts w:ascii="Times New Roman" w:hAnsi="Times New Roman"/>
+          <w:color w:val="000000"/>
+          <w:sz w:val="24"/>
+        </w:rPr>
+        <w:t>Revised input preparation later passed all 16 generation checks. We used these controlled composites, authentic images and conventional-edit controls for a small learning pilot. The masks defined the pasted region, not a verified semantic-change boundary. One editor and sixteen reused parents could not establish broad reliability (Keleş, 2026, E129–E135).</w:t>
       </w:r>
     </w:p>
     <w:p>
@@ -3526,7 +3568,6 @@
     <w:p>
       <w:pPr>
         <w:pStyle w:val="Heading2"/>
-        <w:pageBreakBefore/>
         <w:widowControl/>
         <w:spacing w:line="480" w:lineRule="auto" w:before="0" w:after="0"/>
       </w:pPr>

</xml_diff>

<commit_message>
docs: resolve submission fields with mentor role and sourced supplier
</commit_message>
<xml_diff>
--- a/rapor/final_2026/deliverables/CS395_FinalReport_EfeHan_Keles_29September2026.docx
+++ b/rapor/final_2026/deliverables/CS395_FinalReport_EfeHan_Keles_29September2026.docx
@@ -1078,7 +1078,7 @@
           <w:color w:val="000000"/>
           <w:sz w:val="24"/>
         </w:rPr>
-        <w:t>Turkcell was a relevant competitor discussed during the internship. The names of relevant suppliers remain [TO COMPLETE: confirmed supplier names].</w:t>
+        <w:t>Turkcell was a relevant competitor discussed during the internship. Nokia supplies fixed and mobile network equipment and related services to the Türk Telekom group (Finnvera, 2025).</w:t>
       </w:r>
     </w:p>
     <w:p>
@@ -1107,7 +1107,7 @@
           <w:color w:val="000000"/>
           <w:sz w:val="24"/>
         </w:rPr>
-        <w:t>Figure 1 summarizes the published corporate structure: network and IT support infrastructure, commercial units serve customers, and support units cover finance, staff and coordination (Türk Telekom, 2026a, p. 33). My host unit was Planlama ve Geliştirme Müdürlüğü (Planning and Development Directorate); its reporting line remains [TO COMPLETE: department reporting line].</w:t>
+        <w:t>Figure 1 summarizes the published corporate structure: network and IT support infrastructure, commercial units serve customers, and support units cover finance, staff and coordination (Türk Telekom, 2026a, p. 33). My host unit was Planlama ve Geliştirme Müdürlüğü (Planning and Development Directorate), led by Önder Çelebi.</w:t>
       </w:r>
     </w:p>
     <w:p>
@@ -1215,7 +1215,7 @@
           <w:color w:val="000000"/>
           <w:sz w:val="24"/>
         </w:rPr>
-        <w:t>My host unit, the Planning and Development Directorate, worked on Tivibu software and hardware. My supervisor was Önder Çelebi, Director, at onder.celebi@turktelekom.com.tr. I also consulted Hasan Çontuk (hasan.contuk@turktelekom.com.tr), who worked under Önder Çelebi. His formal job title remains [TO COMPLETE: Hasan Çontuk’s job title]. I worked individually under a hybrid arrangement, Monday–Thursday on site and Friday remote. PixelProof was a student prototype using research data, with no documented company production deployment.</w:t>
+        <w:t>My host unit, the Planning and Development Directorate, worked on Tivibu software and hardware. My supervisor was Önder Çelebi, Director, at onder.celebi@turktelekom.com.tr. Hasan Çontuk (hasan.contuk@turktelekom.com.tr), a member of Önder Çelebi’s team, was my mentor. I consulted him for guidance while making the project decisions myself. I worked individually under a hybrid arrangement, Monday–Thursday on site and Friday remote. PixelProof was a student prototype using research data, with no documented company production deployment.</w:t>
       </w:r>
     </w:p>
     <w:p>
@@ -4471,6 +4471,21 @@
           <w:sz w:val="24"/>
         </w:rPr>
         <w:t>, 28. Retrieved September 25, 2026, from https://proceedings.neurips.cc/paper/2015/hash/bad5f33780c42f2588878a9d07405083-Abstract.html</w:t>
+      </w:r>
+    </w:p>
+    <w:p>
+      <w:pPr>
+        <w:keepLines/>
+        <w:widowControl/>
+        <w:spacing w:line="240" w:lineRule="auto" w:before="0" w:after="240"/>
+      </w:pPr>
+      <w:r>
+        <w:rPr>
+          <w:rFonts w:ascii="Times New Roman" w:hAnsi="Times New Roman"/>
+          <w:color w:val="000000"/>
+          <w:sz w:val="24"/>
+        </w:rPr>
+        <w:t>Finnvera. (2025, October 23). Finnvera guarantees Nokia’s deliveries to Türk Telekom. Retrieved September 29, 2026, from https://www.finnvera.fi/eng/export-and-internationalisation/finnvera-as-an-export-finance-provider/guaranteed-transactions/finnvera-guarantees-nokias-deliveries-to-turk-telekom</w:t>
       </w:r>
     </w:p>
     <w:p>

</xml_diff>